<commit_message>
Trustee profiles: site-visit photo for Harneet, portfolio banner for Aayushi
Co-Authored-By: Claude Opus 5.5 <noreply@anthropic.com>
Claude-Session: https://claude.ai/code/session_01RSCU9Tog2TmXVif83jTYoy
</commit_message>
<xml_diff>
--- a/content/Trustee-Profile-Harneet-Hariharan.docx
+++ b/content/Trustee-Profile-Harneet-Hariharan.docx
@@ -424,7 +424,7 @@
       <w:r>
         <w:drawing>
           <wp:inline distT="0" distB="0" distL="0" distR="0">
-            <wp:extent cx="6115050" cy="1809750"/>
+            <wp:extent cx="6115050" cy="2381250"/>
             <wp:effectExtent t="0" r="0" b="0" l="0"/>
             <wp:docPr id="2" name=""/>
             <wp:cNvGraphicFramePr>
@@ -449,7 +449,7 @@
                   <pic:spPr bwMode="auto">
                     <a:xfrm>
                       <a:off x="0" y="0"/>
-                      <a:ext cx="6115050" cy="1809750"/>
+                      <a:ext cx="6115050" cy="2381250"/>
                     </a:xfrm>
                     <a:prstGeom prst="rect">
                       <a:avLst/>
@@ -475,7 +475,7 @@
           <w:sz w:val="15"/>
           <w:szCs w:val="15"/>
         </w:rPr>
-        <w:t xml:space="preserve">The renewed temple at Govardhan Ecovillage, one of the projects Harneet has supported since 2022.</w:t>
+        <w:t xml:space="preserve">Harneet on site with the project team, reviewing restoration plans.</w:t>
       </w:r>
     </w:p>
     <w:tbl>

</xml_diff>

<commit_message>
Full titles with diacritics for His Holiness Rādhānāth Swāmī Mahārāja and His Grace Gaurāṅga Dās across the site and Harneet's profile; photo caption (not yet published)
Co-Authored-By: Claude Opus 5.5 <noreply@anthropic.com>
Claude-Session: https://claude.ai/code/session_01RSCU9Tog2TmXVif83jTYoy
</commit_message>
<xml_diff>
--- a/content/Trustee-Profile-Harneet-Hariharan.docx
+++ b/content/Trustee-Profile-Harneet-Hariharan.docx
@@ -620,7 +620,7 @@
                 <w:sz w:val="20"/>
                 <w:szCs w:val="20"/>
               </w:rPr>
-              <w:t xml:space="preserve">, supporting Govardhan Annakshetra, the renewal of the temple at Govardhan Ecovillage, the Govardhan Skill Centre, the Bhakti Bhavan project in Kolkata and the revival of the sacred kunds of Braj. Her work is anchored in daily spiritual practice and the study of scripture, under the guidance of HH Radhanath Swami and HG Gauranga Prabhu.</w:t>
+              <w:t xml:space="preserve">, supporting Govardhan Annakshetra, the renewal of the temple at Govardhan Ecovillage, the Govardhan Skill Centre, the Bhakti Bhavan project in Kolkata and the revival of the sacred kunds of Braj. Her work is anchored in daily spiritual practice and the study of scripture, under the guidance of His Holiness Rādhānāth Swāmī Mahārāja and His Grace Gaurāṅga Dās.</w:t>
             </w:r>
           </w:p>
           <w:p>
@@ -1096,7 +1096,7 @@
     <w:p>
       <w:pPr>
         <w:keepNext/>
-        <w:spacing w:after="80" w:before="300" w:line="290"/>
+        <w:spacing w:after="80" w:before="220" w:line="290"/>
       </w:pPr>
       <w:r>
         <w:rPr>
@@ -1371,7 +1371,7 @@
     <w:p>
       <w:pPr>
         <w:keepNext/>
-        <w:spacing w:after="80" w:before="240" w:line="290"/>
+        <w:spacing w:after="80" w:before="200" w:line="290"/>
       </w:pPr>
       <w:r>
         <w:rPr>
@@ -1427,7 +1427,7 @@
           </w:tcPr>
           <w:p>
             <w:pPr>
-              <w:spacing w:after="0" w:before="0"/>
+              <w:spacing w:after="50" w:before="0"/>
             </w:pPr>
             <w:r>
               <w:drawing>
@@ -1468,6 +1468,22 @@
                   </a:graphic>
                 </wp:inline>
               </w:drawing>
+            </w:r>
+          </w:p>
+          <w:p>
+            <w:pPr>
+              <w:spacing w:after="0" w:before="0" w:line="220"/>
+            </w:pPr>
+            <w:r>
+              <w:rPr>
+                <w:rFonts w:ascii="Palatino Linotype" w:cs="Palatino Linotype" w:eastAsia="Palatino Linotype" w:hAnsi="Palatino Linotype"/>
+                <w:i/>
+                <w:iCs/>
+                <w:color w:val="5A5F7E"/>
+                <w:sz w:val="14"/>
+                <w:szCs w:val="14"/>
+              </w:rPr>
+              <w:t xml:space="preserve">From left: His Grace Gaurāṅga Dās, His Holiness Rādhānāth Swāmī Mahārāja and Harneet.</w:t>
             </w:r>
           </w:p>
         </w:tc>
@@ -1638,9 +1654,9 @@
             </w:tcBorders>
             <w:shd w:fill="E7F3F7" w:color="auto" w:val="clear"/>
             <w:tcMar>
-              <w:top w:type="dxa" w:w="240"/>
+              <w:top w:type="dxa" w:w="170"/>
               <w:left w:type="dxa" w:w="360"/>
-              <w:bottom w:type="dxa" w:w="240"/>
+              <w:bottom w:type="dxa" w:w="170"/>
               <w:right w:type="dxa" w:w="360"/>
             </w:tcMar>
             <w:vAlign w:val="top"/>
@@ -1778,7 +1794,7 @@
     </w:tbl>
     <w:p>
       <w:pPr>
-        <w:spacing w:after="160" w:before="0" w:line="290"/>
+        <w:spacing w:after="60" w:before="0" w:line="290"/>
       </w:pPr>
     </w:p>
     <w:tbl>
@@ -1878,7 +1894,7 @@
     </w:tbl>
     <w:sectPr>
       <w:pgSz w:w="11906" w:h="16838" w:orient="portrait"/>
-      <w:pgMar w:top="1800" w:right="1134" w:bottom="900" w:left="1134" w:header="708" w:footer="708" w:gutter="0"/>
+      <w:pgMar w:top="1800" w:right="1134" w:bottom="700" w:left="1134" w:header="708" w:footer="708" w:gutter="0"/>
       <w:pgNumType/>
       <w:docGrid w:linePitch="360"/>
     </w:sectPr>

</xml_diff>